<commit_message>
paper: finalize Cassandra case-study preprint
</commit_message>
<xml_diff>
--- a/paper/preprint/cassandra-preprint-v0.1.docx
+++ b/paper/preprint/cassandra-preprint-v0.1.docx
@@ -3499,10 +3499,10 @@
         <w:rPr>
           <w:rStyle w:val="VerbatimChar"/>
         </w:rPr>
-        <w:t xml:space="preserve">https://github.com/sapsan14/cassandra</w:t>
-      </w:r>
-      <w:r>
-        <w:br/>
+        <w:t xml:space="preserve">https://github.com/tyche-institute/cassandra</w:t>
+      </w:r>
+      <w:r>
+        <w:t xml:space="preserve"> </w:t>
       </w:r>
       <w:r>
         <w:t xml:space="preserve">Dashboard:</w:t>

</xml_diff>